<commit_message>
Make the capstone fully optional (no submission, no deadline, no grading)
Reframe capstone materials to a self-directed, optional take-home:
- Capstone Brief: "optional, nothing to submit, no deadline, no grading"
- Definition of Done: reframed as a self-check (not a graded rubric)
- Sample Scenarios: drop "counts toward"/"how to submit" language
- Session 3 Facilitator + Participant guides + Read-Aloud scripts: capstone is
  "point them to it," optional to build and share, not launched/expected
- README capstone section updated to match

Removes the per-person feedback burden for large cohorts. Aligns with the
proposal's original "share it in Slack" intent.

Co-Authored-By: Claude Opus 4.8 <noreply@anthropic.com>
</commit_message>
<xml_diff>
--- a/Capstone/Capstone Brief.docx
+++ b/Capstone/Capstone Brief.docx
@@ -27,7 +27,7 @@
           <w:color w:val="101110"/>
           <w:sz w:val="44"/>
         </w:rPr>
-        <w:t>Capstone Brief — Build a Reusable AI‑Assisted Workflow</w:t>
+        <w:t>Capstone Project (Optional)</w:t>
       </w:r>
     </w:p>
     <w:p>
@@ -48,7 +48,7 @@
           <w:color w:val="101110"/>
           <w:sz w:val="22"/>
         </w:rPr>
-        <w:t xml:space="preserve">This is the deliverable that outlasts the course: </w:t>
+        <w:t xml:space="preserve">The capstone is the thing you actually take back to work: </w:t>
       </w:r>
       <w:r>
         <w:rPr>
@@ -57,7 +57,7 @@
           <w:color w:val="101110"/>
           <w:sz w:val="22"/>
         </w:rPr>
-        <w:t>a working Excel workflow, built on your own data, that you can run again next month with minimal manual work.</w:t>
+        <w:t>a real Excel workflow, built on your own data, that you can run again next month with minimal effort.</w:t>
       </w:r>
       <w:r>
         <w:rPr>
@@ -65,16 +65,8 @@
           <w:color w:val="101110"/>
           <w:sz w:val="22"/>
         </w:rPr>
-        <w:t xml:space="preserve"> Not a one‑off analysis — a repeatable asset.</w:t>
+        <w:t xml:space="preserve"> It's the natural next step after the three sessions.</w:t>
       </w:r>
-    </w:p>
-    <w:p>
-      <w:pPr>
-        <w:spacing w:before="40" w:after="160"/>
-        <w:pBdr>
-          <w:bottom w:val="single" w:sz="18" w:space="1" w:color="B1E882"/>
-        </w:pBdr>
-      </w:pPr>
     </w:p>
     <w:p>
       <w:pPr>
@@ -87,7 +79,7 @@
           <w:color w:val="101110"/>
           <w:sz w:val="30"/>
         </w:rPr>
-        <w:t>How the capstone works (read this first)</w:t>
+        <w:t>How it works — the short version</w:t>
       </w:r>
     </w:p>
     <w:p>
@@ -101,7 +93,7 @@
           <w:color w:val="101110"/>
           <w:sz w:val="22"/>
         </w:rPr>
-        <w:t>Is it required?</w:t>
+        <w:t>This is optional, and it's yours.</w:t>
       </w:r>
       <w:r>
         <w:rPr>
@@ -109,13 +101,8 @@
           <w:color w:val="101110"/>
           <w:sz w:val="22"/>
         </w:rPr>
-        <w:t xml:space="preserve"> Yes. The capstone is the point of the course — it's where you turn the three sessions into something you actually use at work. It is not optional extra credit.</w:t>
+        <w:t xml:space="preserve"> There's </w:t>
       </w:r>
-    </w:p>
-    <w:p>
-      <w:pPr>
-        <w:spacing w:after="120"/>
-      </w:pPr>
       <w:r>
         <w:rPr>
           <w:rFonts w:ascii="Calibri" w:hAnsi="Calibri"/>
@@ -123,7 +110,15 @@
           <w:color w:val="101110"/>
           <w:sz w:val="22"/>
         </w:rPr>
-        <w:t>When do I do it?</w:t>
+        <w:t>no submission, no deadline, and no grading.</w:t>
+      </w:r>
+      <w:r>
+        <w:rPr>
+          <w:rFonts w:ascii="Calibri" w:hAnsi="Calibri"/>
+          <w:color w:val="101110"/>
+          <w:sz w:val="22"/>
+        </w:rPr>
+        <w:t xml:space="preserve"> Nobody is going to review it or mark it. It exists for one reason: building one is by far the best way to make these skills stick, and you walk away with something genuinely useful.</w:t>
       </w:r>
     </w:p>
     <w:p>
@@ -139,7 +134,7 @@
           <w:color w:val="101110"/>
           <w:sz w:val="22"/>
         </w:rPr>
-        <w:t>You start it live in Session 3.</w:t>
+        <w:t>Build it on your own time</w:t>
       </w:r>
       <w:r>
         <w:rPr>
@@ -147,20 +142,7 @@
           <w:color w:val="101110"/>
           <w:sz w:val="22"/>
         </w:rPr>
-        <w:t xml:space="preserve"> We reserve time at the end of that session</w:t>
-      </w:r>
-    </w:p>
-    <w:p>
-      <w:pPr>
-        <w:spacing w:after="120"/>
-      </w:pPr>
-      <w:r>
-        <w:rPr>
-          <w:rFonts w:ascii="Calibri" w:hAnsi="Calibri"/>
-          <w:color w:val="101110"/>
-          <w:sz w:val="22"/>
-        </w:rPr>
-        <w:t>to begin building on your own data, with the instructor floating to help.</w:t>
+        <w:t>, whenever suits you, using what you learned.</w:t>
       </w:r>
     </w:p>
     <w:p>
@@ -176,7 +158,7 @@
           <w:color w:val="101110"/>
           <w:sz w:val="22"/>
         </w:rPr>
-        <w:t>You finish it on your own</w:t>
+        <w:t>Use your own data, or a ready‑made scenario.</w:t>
       </w:r>
       <w:r>
         <w:rPr>
@@ -184,78 +166,7 @@
           <w:color w:val="101110"/>
           <w:sz w:val="22"/>
         </w:rPr>
-        <w:t xml:space="preserve"> in the days after Session 3.</w:t>
-      </w:r>
-    </w:p>
-    <w:p>
-      <w:pPr>
-        <w:spacing w:after="120"/>
-      </w:pPr>
-      <w:r>
-        <w:rPr>
-          <w:rFonts w:ascii="Calibri" w:hAnsi="Calibri"/>
-          <w:b/>
-          <w:color w:val="101110"/>
-          <w:sz w:val="22"/>
-        </w:rPr>
-        <w:t>Do I present it live?</w:t>
-      </w:r>
-      <w:r>
-        <w:rPr>
-          <w:rFonts w:ascii="Calibri" w:hAnsi="Calibri"/>
-          <w:color w:val="101110"/>
-          <w:sz w:val="22"/>
-        </w:rPr>
-        <w:t xml:space="preserve"> No. There's no live presentation — instead you </w:t>
-      </w:r>
-      <w:r>
-        <w:rPr>
-          <w:rFonts w:ascii="Calibri" w:hAnsi="Calibri"/>
-          <w:b/>
-          <w:color w:val="101110"/>
-          <w:sz w:val="22"/>
-        </w:rPr>
-        <w:t>share it in the course Slack `#capstones` channel</w:t>
-      </w:r>
-      <w:r>
-        <w:rPr>
-          <w:rFonts w:ascii="Calibri" w:hAnsi="Calibri"/>
-          <w:color w:val="101110"/>
-          <w:sz w:val="22"/>
-        </w:rPr>
-        <w:t xml:space="preserve"> by the deadline. Post:</w:t>
-      </w:r>
-    </w:p>
-    <w:p>
-      <w:pPr>
-        <w:pStyle w:val="ListNumber"/>
-        <w:spacing w:after="40"/>
-        <w:ind w:left="432" w:hanging="259"/>
-      </w:pPr>
-      <w:r>
-        <w:rPr>
-          <w:rFonts w:ascii="Calibri" w:hAnsi="Calibri"/>
-          <w:color w:val="101110"/>
-          <w:sz w:val="22"/>
-        </w:rPr>
-        <w:t xml:space="preserve">Your </w:t>
-      </w:r>
-      <w:r>
-        <w:rPr>
-          <w:rFonts w:ascii="Calibri" w:hAnsi="Calibri"/>
-          <w:b/>
-          <w:color w:val="101110"/>
-          <w:sz w:val="22"/>
-        </w:rPr>
-        <w:t>workbook</w:t>
-      </w:r>
-      <w:r>
-        <w:rPr>
-          <w:rFonts w:ascii="Calibri" w:hAnsi="Calibri"/>
-          <w:color w:val="101110"/>
-          <w:sz w:val="22"/>
-        </w:rPr>
-        <w:t xml:space="preserve"> (or a short screen recording / a few screenshots if you</w:t>
+        <w:t xml:space="preserve"> If you don't have data you can</w:t>
       </w:r>
     </w:p>
     <w:p>
@@ -268,22 +179,7 @@
           <w:color w:val="101110"/>
           <w:sz w:val="22"/>
         </w:rPr>
-        <w:t>can't share the file),</w:t>
-      </w:r>
-    </w:p>
-    <w:p>
-      <w:pPr>
-        <w:pStyle w:val="ListNumber"/>
-        <w:spacing w:after="40"/>
-        <w:ind w:left="432" w:hanging="259"/>
-      </w:pPr>
-      <w:r>
-        <w:rPr>
-          <w:rFonts w:ascii="Calibri" w:hAnsi="Calibri"/>
-          <w:color w:val="101110"/>
-          <w:sz w:val="22"/>
-        </w:rPr>
-        <w:t xml:space="preserve">Your </w:t>
+        <w:t xml:space="preserve">use (or you'd rather not deal with anonymizing), grab one of the three in </w:t>
       </w:r>
       <w:r>
         <w:rPr>
@@ -292,7 +188,7 @@
           <w:color w:val="101110"/>
           <w:sz w:val="22"/>
         </w:rPr>
-        <w:t>run‑book</w:t>
+        <w:t>Sample Scenarios</w:t>
       </w:r>
       <w:r>
         <w:rPr>
@@ -300,12 +196,12 @@
           <w:color w:val="101110"/>
           <w:sz w:val="22"/>
         </w:rPr>
-        <w:t xml:space="preserve"> (the README tab is fine), and</w:t>
+        <w:t xml:space="preserve"> — they come with data and count exactly the same.</w:t>
       </w:r>
     </w:p>
     <w:p>
       <w:pPr>
-        <w:pStyle w:val="ListNumber"/>
+        <w:pStyle w:val="ListBullet"/>
         <w:spacing w:after="40"/>
         <w:ind w:left="432" w:hanging="259"/>
       </w:pPr>
@@ -316,7 +212,7 @@
           <w:color w:val="101110"/>
           <w:sz w:val="22"/>
         </w:rPr>
-        <w:t>One sentence</w:t>
+        <w:t>Share it in the Slack channel if you'd like.</w:t>
       </w:r>
       <w:r>
         <w:rPr>
@@ -324,7 +220,7 @@
           <w:color w:val="101110"/>
           <w:sz w:val="22"/>
         </w:rPr>
-        <w:t xml:space="preserve"> on where you still review the AI's output by hand.</w:t>
+        <w:t xml:space="preserve"> We'd love to see what you</w:t>
       </w:r>
     </w:p>
     <w:p>
@@ -334,11 +230,26 @@
       <w:r>
         <w:rPr>
           <w:rFonts w:ascii="Calibri" w:hAnsi="Calibri"/>
+          <w:color w:val="101110"/>
+          <w:sz w:val="22"/>
+        </w:rPr>
+        <w:t>build, and folks are welcome to cheer each other on — but sharing is completely optional and there's no expectation either way.</w:t>
+      </w:r>
+    </w:p>
+    <w:p>
+      <w:pPr>
+        <w:pStyle w:val="ListBullet"/>
+        <w:spacing w:after="40"/>
+        <w:ind w:left="432" w:hanging="259"/>
+      </w:pPr>
+      <w:r>
+        <w:rPr>
+          <w:rFonts w:ascii="Calibri" w:hAnsi="Calibri"/>
           <w:b/>
           <w:color w:val="101110"/>
           <w:sz w:val="22"/>
         </w:rPr>
-        <w:t>Deadline:</w:t>
+        <w:t>Know it's solid</w:t>
       </w:r>
       <w:r>
         <w:rPr>
@@ -346,15 +257,16 @@
           <w:color w:val="101110"/>
           <w:sz w:val="22"/>
         </w:rPr>
-        <w:t xml:space="preserve"> </w:t>
+        <w:t xml:space="preserve"> by running it past the </w:t>
       </w:r>
       <w:r>
         <w:rPr>
-          <w:rFonts w:ascii="Consolas" w:hAnsi="Consolas"/>
-          <w:color w:val="333333"/>
+          <w:rFonts w:ascii="Calibri" w:hAnsi="Calibri"/>
+          <w:b/>
+          <w:color w:val="101110"/>
           <w:sz w:val="22"/>
         </w:rPr>
-        <w:t>&lt;set a date — suggested: one week after Session 3&gt;</w:t>
+        <w:t>Definition of Done</w:t>
       </w:r>
       <w:r>
         <w:rPr>
@@ -362,7 +274,7 @@
           <w:color w:val="101110"/>
           <w:sz w:val="22"/>
         </w:rPr>
-        <w:t>.</w:t>
+        <w:t xml:space="preserve"> self‑check in</w:t>
       </w:r>
     </w:p>
     <w:p>
@@ -372,62 +284,11 @@
       <w:r>
         <w:rPr>
           <w:rFonts w:ascii="Calibri" w:hAnsi="Calibri"/>
-          <w:b/>
           <w:color w:val="101110"/>
           <w:sz w:val="22"/>
         </w:rPr>
-        <w:t>Will I get feedback?</w:t>
+        <w:t>this folder. That's for you, not for anyone to grade.</w:t>
       </w:r>
-      <w:r>
-        <w:rPr>
-          <w:rFonts w:ascii="Calibri" w:hAnsi="Calibri"/>
-          <w:color w:val="101110"/>
-          <w:sz w:val="22"/>
-        </w:rPr>
-        <w:t xml:space="preserve"> Yes — the instructor reviews each submission against the rubric below, and </w:t>
-      </w:r>
-      <w:r>
-        <w:rPr>
-          <w:rFonts w:ascii="Calibri" w:hAnsi="Calibri"/>
-          <w:b/>
-          <w:color w:val="101110"/>
-          <w:sz w:val="22"/>
-        </w:rPr>
-        <w:t>peer feedback is encouraged</w:t>
-      </w:r>
-      <w:r>
-        <w:rPr>
-          <w:rFonts w:ascii="Calibri" w:hAnsi="Calibri"/>
-          <w:color w:val="101110"/>
-          <w:sz w:val="22"/>
-        </w:rPr>
-        <w:t xml:space="preserve"> in the channel. Reading someone else's workflow is half the learning.</w:t>
-      </w:r>
-    </w:p>
-    <w:p>
-      <w:pPr>
-        <w:spacing w:after="80"/>
-        <w:ind w:left="360"/>
-        <w:pBdr>
-          <w:left w:val="single" w:sz="24" w:space="8" w:color="B1E882"/>
-        </w:pBdr>
-      </w:pPr>
-      <w:r>
-        <w:rPr>
-          <w:rFonts w:ascii="Calibri" w:hAnsi="Calibri"/>
-          <w:color w:val="3A3D38"/>
-          <w:sz w:val="22"/>
-        </w:rPr>
-        <w:t>Optional: if your cohort wants to share live, the instructor may host a voluntary "demo day" — a short call where a few people walk through their workflow. That's a bonus, never a requirement.</w:t>
-      </w:r>
-    </w:p>
-    <w:p>
-      <w:pPr>
-        <w:spacing w:before="40" w:after="160"/>
-        <w:pBdr>
-          <w:bottom w:val="single" w:sz="18" w:space="1" w:color="B1E882"/>
-        </w:pBdr>
-      </w:pPr>
     </w:p>
     <w:p>
       <w:pPr>
@@ -470,13 +331,8 @@
           <w:color w:val="101110"/>
           <w:sz w:val="22"/>
         </w:rPr>
-        <w:t xml:space="preserve"> you do and rebuild it as a workflow that follows the four‑box pattern from Session 3:</w:t>
+        <w:t xml:space="preserve"> and rebuild it as a workflow that follows the four‑box pattern from Session 3: </w:t>
       </w:r>
-    </w:p>
-    <w:p>
-      <w:pPr>
-        <w:spacing w:after="120"/>
-      </w:pPr>
       <w:r>
         <w:rPr>
           <w:rFonts w:ascii="Calibri" w:hAnsi="Calibri"/>
@@ -489,14 +345,6 @@
     </w:p>
     <w:p>
       <w:pPr>
-        <w:spacing w:before="40" w:after="160"/>
-        <w:pBdr>
-          <w:bottom w:val="single" w:sz="18" w:space="1" w:color="B1E882"/>
-        </w:pBdr>
-      </w:pPr>
-    </w:p>
-    <w:p>
-      <w:pPr>
         <w:spacing w:before="200" w:after="60"/>
       </w:pPr>
       <w:r>
@@ -506,7 +354,7 @@
           <w:color w:val="101110"/>
           <w:sz w:val="30"/>
         </w:rPr>
-        <w:t>Examples (pick something small and finish it)</w:t>
+        <w:t>Good examples (pick something small and finish it)</w:t>
       </w:r>
     </w:p>
     <w:p>
@@ -538,7 +386,7 @@
           <w:color w:val="101110"/>
           <w:sz w:val="22"/>
         </w:rPr>
-        <w:t xml:space="preserve"> — drop in the new export, hit Refresh, report updates.</w:t>
+        <w:t xml:space="preserve"> — drop in the new export, hit Refresh, done.</w:t>
       </w:r>
     </w:p>
     <w:p>
@@ -570,7 +418,7 @@
           <w:color w:val="101110"/>
           <w:sz w:val="22"/>
         </w:rPr>
-        <w:t xml:space="preserve"> — the same messy export, cleaned the same way every time.</w:t>
+        <w:t xml:space="preserve"> — the same messy export, cleaned the same way each time.</w:t>
       </w:r>
     </w:p>
     <w:p>
@@ -602,7 +450,7 @@
           <w:color w:val="101110"/>
           <w:sz w:val="22"/>
         </w:rPr>
-        <w:t xml:space="preserve"> — raw transactions in, a clean summary or simple dashboard out.</w:t>
+        <w:t xml:space="preserve"> — raw transactions in, a clean summary out.</w:t>
       </w:r>
     </w:p>
     <w:p>
@@ -634,7 +482,7 @@
           <w:color w:val="101110"/>
           <w:sz w:val="22"/>
         </w:rPr>
-        <w:t xml:space="preserve"> workflow — a gnarly workbook made understandable and maintainable, with AI‑written documentation.</w:t>
+        <w:t xml:space="preserve"> workflow — a gnarly workbook made maintainable.</w:t>
       </w:r>
     </w:p>
     <w:p>
@@ -651,16 +499,25 @@
           <w:color w:val="3A3D38"/>
           <w:sz w:val="22"/>
         </w:rPr>
-        <w:t>No ideal data of your own? Use the Session 3 datasets and build the monthly spend report end to end. That fully satisfies the capstone.</w:t>
+        <w:t xml:space="preserve">No ideal data of your own? Use one of the </w:t>
       </w:r>
-    </w:p>
-    <w:p>
-      <w:pPr>
-        <w:spacing w:before="40" w:after="160"/>
-        <w:pBdr>
-          <w:bottom w:val="single" w:sz="18" w:space="1" w:color="B1E882"/>
-        </w:pBdr>
-      </w:pPr>
+      <w:r>
+        <w:rPr>
+          <w:rFonts w:ascii="Calibri" w:hAnsi="Calibri"/>
+          <w:b/>
+          <w:color w:val="3A3D38"/>
+          <w:sz w:val="22"/>
+        </w:rPr>
+        <w:t>Sample Scenarios</w:t>
+      </w:r>
+      <w:r>
+        <w:rPr>
+          <w:rFonts w:ascii="Calibri" w:hAnsi="Calibri"/>
+          <w:color w:val="3A3D38"/>
+          <w:sz w:val="22"/>
+        </w:rPr>
+        <w:t xml:space="preserve"> and build the monthly report end to end. That fully counts as a capstone.</w:t>
+      </w:r>
     </w:p>
     <w:p>
       <w:pPr>
@@ -707,19 +564,10 @@
       <w:r>
         <w:rPr>
           <w:rFonts w:ascii="Calibri" w:hAnsi="Calibri"/>
-          <w:b/>
           <w:color w:val="101110"/>
           <w:sz w:val="22"/>
         </w:rPr>
-        <w:t>Connect, don't paste</w:t>
-      </w:r>
-      <w:r>
-        <w:rPr>
-          <w:rFonts w:ascii="Calibri" w:hAnsi="Calibri"/>
-          <w:color w:val="101110"/>
-          <w:sz w:val="22"/>
-        </w:rPr>
-        <w:t>, so it can be refreshed.</w:t>
+        <w:t>Connect, don't paste, so it can refresh.</w:t>
       </w:r>
     </w:p>
     <w:p>
@@ -743,7 +591,7 @@
           <w:color w:val="101110"/>
           <w:sz w:val="22"/>
         </w:rPr>
-        <w:t xml:space="preserve"> — use Power Query so the cleaning steps are recorded and re‑run on</w:t>
+        <w:t xml:space="preserve"> — use Power Query so the steps are recorded and re‑run on refresh.</w:t>
       </w:r>
     </w:p>
     <w:p>
@@ -756,7 +604,7 @@
           <w:color w:val="101110"/>
           <w:sz w:val="22"/>
         </w:rPr>
-        <w:t>refresh. Use AI to draft any tricky transforms — and check them.</w:t>
+        <w:t>Use AI to draft any tricky transforms, and check them.</w:t>
       </w:r>
     </w:p>
     <w:p>
@@ -793,7 +641,7 @@
           <w:color w:val="101110"/>
           <w:sz w:val="22"/>
         </w:rPr>
-        <w:t>PivotTable or Python in Excel. One source of truth feeds the output.</w:t>
+        <w:t>PivotTable or Python in Excel.</w:t>
       </w:r>
     </w:p>
     <w:p>
@@ -817,16 +665,21 @@
           <w:color w:val="101110"/>
           <w:sz w:val="22"/>
         </w:rPr>
-        <w:t xml:space="preserve"> — have AI draft a short run‑book, then </w:t>
+        <w:t xml:space="preserve"> — have AI draft a short run‑book, then edit it to make it true.</w:t>
       </w:r>
+    </w:p>
+    <w:p>
+      <w:pPr>
+        <w:spacing w:before="200" w:after="60"/>
+      </w:pPr>
       <w:r>
         <w:rPr>
           <w:rFonts w:ascii="Calibri" w:hAnsi="Calibri"/>
           <w:b/>
           <w:color w:val="101110"/>
-          <w:sz w:val="22"/>
+          <w:sz w:val="30"/>
         </w:rPr>
-        <w:t>edit it to make it true.</w:t>
+        <w:t>How to know it's good</w:t>
       </w:r>
     </w:p>
     <w:p>
@@ -839,15 +692,16 @@
           <w:color w:val="101110"/>
           <w:sz w:val="22"/>
         </w:rPr>
-        <w:t xml:space="preserve">Put it in a </w:t>
+        <w:t xml:space="preserve">Run it past the </w:t>
       </w:r>
       <w:r>
         <w:rPr>
-          <w:rFonts w:ascii="Consolas" w:hAnsi="Consolas"/>
-          <w:color w:val="333333"/>
+          <w:rFonts w:ascii="Calibri" w:hAnsi="Calibri"/>
+          <w:b/>
+          <w:color w:val="101110"/>
           <w:sz w:val="22"/>
         </w:rPr>
-        <w:t>README</w:t>
+        <w:t>Definition of Done</w:t>
       </w:r>
       <w:r>
         <w:rPr>
@@ -855,350 +709,8 @@
           <w:color w:val="101110"/>
           <w:sz w:val="22"/>
         </w:rPr>
-        <w:t xml:space="preserve"> tab. Name where a human still needs to review.</w:t>
+        <w:t xml:space="preserve"> checklist (this folder): it repeats, AI was used and checked, it's documented, and you can explain it. That's the whole bar — no polish required, no one grading it.</w:t>
       </w:r>
-    </w:p>
-    <w:p>
-      <w:pPr>
-        <w:spacing w:before="40" w:after="160"/>
-        <w:pBdr>
-          <w:bottom w:val="single" w:sz="18" w:space="1" w:color="B1E882"/>
-        </w:pBdr>
-      </w:pPr>
-    </w:p>
-    <w:p>
-      <w:pPr>
-        <w:spacing w:before="200" w:after="60"/>
-      </w:pPr>
-      <w:r>
-        <w:rPr>
-          <w:rFonts w:ascii="Calibri" w:hAnsi="Calibri"/>
-          <w:b/>
-          <w:color w:val="101110"/>
-          <w:sz w:val="30"/>
-        </w:rPr>
-        <w:t>How it's graded (rubric)</w:t>
-      </w:r>
-    </w:p>
-    <w:p>
-      <w:pPr>
-        <w:spacing w:after="120"/>
-      </w:pPr>
-      <w:r>
-        <w:rPr>
-          <w:rFonts w:ascii="Calibri" w:hAnsi="Calibri"/>
-          <w:color w:val="101110"/>
-          <w:sz w:val="22"/>
-        </w:rPr>
-        <w:t>You're not graded on size or polish — on whether it's a real, trustworthy, repeatable workflow.</w:t>
-      </w:r>
-    </w:p>
-    <w:tbl>
-      <w:tblPr>
-        <w:tblStyle w:val="TableGrid"/>
-        <w:tblW w:type="auto" w:w="0"/>
-        <w:tblLook w:firstColumn="1" w:firstRow="1" w:lastColumn="0" w:lastRow="0" w:noHBand="0" w:noVBand="1" w:val="04A0"/>
-      </w:tblPr>
-      <w:tblGrid>
-        <w:gridCol w:w="3216"/>
-        <w:gridCol w:w="3216"/>
-        <w:gridCol w:w="3216"/>
-      </w:tblGrid>
-      <w:tr>
-        <w:tc>
-          <w:tcPr>
-            <w:tcW w:type="dxa" w:w="3216"/>
-            <w:shd w:val="clear" w:fill="101110"/>
-          </w:tcPr>
-          <w:p>
-            <w:r>
-              <w:rPr>
-                <w:b/>
-                <w:color w:val="FFFFFF"/>
-              </w:rPr>
-            </w:r>
-            <w:r>
-              <w:rPr>
-                <w:rFonts w:ascii="Calibri" w:hAnsi="Calibri"/>
-                <w:b/>
-                <w:color w:val="FFFFFF"/>
-                <w:sz w:val="20"/>
-              </w:rPr>
-              <w:t>Criterion</w:t>
-            </w:r>
-          </w:p>
-        </w:tc>
-        <w:tc>
-          <w:tcPr>
-            <w:tcW w:type="dxa" w:w="3216"/>
-            <w:shd w:val="clear" w:fill="101110"/>
-          </w:tcPr>
-          <w:p>
-            <w:r>
-              <w:rPr>
-                <w:b/>
-                <w:color w:val="FFFFFF"/>
-              </w:rPr>
-            </w:r>
-            <w:r>
-              <w:rPr>
-                <w:rFonts w:ascii="Calibri" w:hAnsi="Calibri"/>
-                <w:b/>
-                <w:color w:val="FFFFFF"/>
-                <w:sz w:val="20"/>
-              </w:rPr>
-              <w:t>What we're looking for</w:t>
-            </w:r>
-          </w:p>
-        </w:tc>
-        <w:tc>
-          <w:tcPr>
-            <w:tcW w:type="dxa" w:w="3216"/>
-            <w:shd w:val="clear" w:fill="101110"/>
-          </w:tcPr>
-          <w:p>
-            <w:r>
-              <w:rPr>
-                <w:b/>
-                <w:color w:val="FFFFFF"/>
-              </w:rPr>
-            </w:r>
-            <w:r>
-              <w:rPr>
-                <w:rFonts w:ascii="Calibri" w:hAnsi="Calibri"/>
-                <w:b/>
-                <w:color w:val="FFFFFF"/>
-                <w:sz w:val="20"/>
-              </w:rPr>
-              <w:t>✓</w:t>
-            </w:r>
-          </w:p>
-        </w:tc>
-      </w:tr>
-      <w:tr>
-        <w:tc>
-          <w:tcPr>
-            <w:tcW w:type="dxa" w:w="3216"/>
-          </w:tcPr>
-          <w:p>
-            <w:r/>
-            <w:r>
-              <w:rPr>
-                <w:rFonts w:ascii="Calibri" w:hAnsi="Calibri"/>
-                <w:b/>
-                <w:color w:val="101110"/>
-                <w:sz w:val="20"/>
-              </w:rPr>
-              <w:t>It repeats</w:t>
-            </w:r>
-          </w:p>
-        </w:tc>
-        <w:tc>
-          <w:tcPr>
-            <w:tcW w:type="dxa" w:w="3216"/>
-          </w:tcPr>
-          <w:p>
-            <w:r/>
-            <w:r>
-              <w:rPr>
-                <w:rFonts w:ascii="Calibri" w:hAnsi="Calibri"/>
-                <w:color w:val="101110"/>
-                <w:sz w:val="20"/>
-              </w:rPr>
-              <w:t>Refreshing or re‑running takes minimal manual work. "Connect, don't paste" is visible.</w:t>
-            </w:r>
-          </w:p>
-        </w:tc>
-        <w:tc>
-          <w:tcPr>
-            <w:tcW w:type="dxa" w:w="3216"/>
-          </w:tcPr>
-          <w:p>
-            <w:r/>
-          </w:p>
-        </w:tc>
-      </w:tr>
-      <w:tr>
-        <w:tc>
-          <w:tcPr>
-            <w:tcW w:type="dxa" w:w="3216"/>
-          </w:tcPr>
-          <w:p>
-            <w:r/>
-            <w:r>
-              <w:rPr>
-                <w:rFonts w:ascii="Calibri" w:hAnsi="Calibri"/>
-                <w:b/>
-                <w:color w:val="101110"/>
-                <w:sz w:val="20"/>
-              </w:rPr>
-              <w:t>AI was used well</w:t>
-            </w:r>
-          </w:p>
-        </w:tc>
-        <w:tc>
-          <w:tcPr>
-            <w:tcW w:type="dxa" w:w="3216"/>
-          </w:tcPr>
-          <w:p>
-            <w:r/>
-            <w:r>
-              <w:rPr>
-                <w:rFonts w:ascii="Calibri" w:hAnsi="Calibri"/>
-                <w:color w:val="101110"/>
-                <w:sz w:val="20"/>
-              </w:rPr>
-              <w:t xml:space="preserve">AI helped draft formulas, steps, or docs — and you can show where you </w:t>
-            </w:r>
-            <w:r>
-              <w:rPr>
-                <w:rFonts w:ascii="Calibri" w:hAnsi="Calibri"/>
-                <w:b/>
-                <w:color w:val="101110"/>
-                <w:sz w:val="20"/>
-              </w:rPr>
-              <w:t>checked or corrected</w:t>
-            </w:r>
-            <w:r>
-              <w:rPr>
-                <w:rFonts w:ascii="Calibri" w:hAnsi="Calibri"/>
-                <w:color w:val="101110"/>
-                <w:sz w:val="20"/>
-              </w:rPr>
-              <w:t xml:space="preserve"> it.</w:t>
-            </w:r>
-          </w:p>
-        </w:tc>
-        <w:tc>
-          <w:tcPr>
-            <w:tcW w:type="dxa" w:w="3216"/>
-          </w:tcPr>
-          <w:p>
-            <w:r/>
-          </w:p>
-        </w:tc>
-      </w:tr>
-      <w:tr>
-        <w:tc>
-          <w:tcPr>
-            <w:tcW w:type="dxa" w:w="3216"/>
-          </w:tcPr>
-          <w:p>
-            <w:r/>
-            <w:r>
-              <w:rPr>
-                <w:rFonts w:ascii="Calibri" w:hAnsi="Calibri"/>
-                <w:b/>
-                <w:color w:val="101110"/>
-                <w:sz w:val="20"/>
-              </w:rPr>
-              <w:t>It's documented</w:t>
-            </w:r>
-          </w:p>
-        </w:tc>
-        <w:tc>
-          <w:tcPr>
-            <w:tcW w:type="dxa" w:w="3216"/>
-          </w:tcPr>
-          <w:p>
-            <w:r/>
-            <w:r>
-              <w:rPr>
-                <w:rFonts w:ascii="Calibri" w:hAnsi="Calibri"/>
-                <w:color w:val="101110"/>
-                <w:sz w:val="20"/>
-              </w:rPr>
-              <w:t>A short run‑book (AI‑drafted, human‑edited) explains how to run it and what to verify.</w:t>
-            </w:r>
-          </w:p>
-        </w:tc>
-        <w:tc>
-          <w:tcPr>
-            <w:tcW w:type="dxa" w:w="3216"/>
-          </w:tcPr>
-          <w:p>
-            <w:r/>
-          </w:p>
-        </w:tc>
-      </w:tr>
-      <w:tr>
-        <w:tc>
-          <w:tcPr>
-            <w:tcW w:type="dxa" w:w="3216"/>
-          </w:tcPr>
-          <w:p>
-            <w:r/>
-            <w:r>
-              <w:rPr>
-                <w:rFonts w:ascii="Calibri" w:hAnsi="Calibri"/>
-                <w:b/>
-                <w:color w:val="101110"/>
-                <w:sz w:val="20"/>
-              </w:rPr>
-              <w:t>You understand it</w:t>
-            </w:r>
-          </w:p>
-        </w:tc>
-        <w:tc>
-          <w:tcPr>
-            <w:tcW w:type="dxa" w:w="3216"/>
-          </w:tcPr>
-          <w:p>
-            <w:r/>
-            <w:r>
-              <w:rPr>
-                <w:rFonts w:ascii="Calibri" w:hAnsi="Calibri"/>
-                <w:color w:val="101110"/>
-                <w:sz w:val="20"/>
-              </w:rPr>
-              <w:t>You can explain each step and name where human judgment is still required.</w:t>
-            </w:r>
-          </w:p>
-        </w:tc>
-        <w:tc>
-          <w:tcPr>
-            <w:tcW w:type="dxa" w:w="3216"/>
-          </w:tcPr>
-          <w:p>
-            <w:r/>
-          </w:p>
-        </w:tc>
-      </w:tr>
-    </w:tbl>
-    <w:p>
-      <w:pPr>
-        <w:spacing w:after="80"/>
-      </w:pPr>
-    </w:p>
-    <w:p>
-      <w:pPr>
-        <w:spacing w:after="120"/>
-      </w:pPr>
-      <w:r>
-        <w:rPr>
-          <w:rFonts w:ascii="Calibri" w:hAnsi="Calibri"/>
-          <w:b/>
-          <w:color w:val="101110"/>
-          <w:sz w:val="22"/>
-        </w:rPr>
-        <w:t>Showing where you corrected the AI is a feature, not a confession</w:t>
-      </w:r>
-      <w:r>
-        <w:rPr>
-          <w:rFonts w:ascii="Calibri" w:hAnsi="Calibri"/>
-          <w:color w:val="101110"/>
-          <w:sz w:val="22"/>
-        </w:rPr>
-        <w:t xml:space="preserve"> — it's exactly the judgment this course teaches.</w:t>
-      </w:r>
-    </w:p>
-    <w:p>
-      <w:pPr>
-        <w:spacing w:before="40" w:after="160"/>
-        <w:pBdr>
-          <w:bottom w:val="single" w:sz="18" w:space="1" w:color="B1E882"/>
-        </w:pBdr>
-      </w:pPr>
     </w:p>
     <w:p>
       <w:pPr>
@@ -1235,7 +747,7 @@
           <w:color w:val="101110"/>
           <w:sz w:val="22"/>
         </w:rPr>
-        <w:t xml:space="preserve"> A single recurring report done well beats</w:t>
+        <w:t xml:space="preserve"> A single recurring report done well beats an</w:t>
       </w:r>
     </w:p>
     <w:p>
@@ -1248,7 +760,7 @@
           <w:color w:val="101110"/>
           <w:sz w:val="22"/>
         </w:rPr>
-        <w:t>an ambitious half‑built pipeline.</w:t>
+        <w:t>ambitious half‑built pipeline.</w:t>
       </w:r>
     </w:p>
     <w:p>
@@ -1264,7 +776,7 @@
           <w:color w:val="101110"/>
           <w:sz w:val="22"/>
         </w:rPr>
-        <w:t>Anonymize.</w:t>
+        <w:t>Anonymize, or just use a scenario.</w:t>
       </w:r>
       <w:r>
         <w:rPr>
@@ -1272,7 +784,7 @@
           <w:color w:val="101110"/>
           <w:sz w:val="22"/>
         </w:rPr>
-        <w:t xml:space="preserve"> Keep confidential or regulated data out of public AI tools</w:t>
+        <w:t xml:space="preserve"> Keep confidential data out of public AI</w:t>
       </w:r>
     </w:p>
     <w:p>
@@ -1285,7 +797,7 @@
           <w:color w:val="101110"/>
           <w:sz w:val="22"/>
         </w:rPr>
-        <w:t>unless your organization has approved them. A small sample proves the workflow.</w:t>
+        <w:t>tools; a small sample proves the workflow, and the scenarios sidestep it entirely.</w:t>
       </w:r>
     </w:p>
     <w:p>
@@ -1301,7 +813,7 @@
           <w:color w:val="101110"/>
           <w:sz w:val="22"/>
         </w:rPr>
-        <w:t>Reuse what you already have:</w:t>
+        <w:t>Reuse what you already have</w:t>
       </w:r>
       <w:r>
         <w:rPr>
@@ -1309,7 +821,7 @@
           <w:color w:val="101110"/>
           <w:sz w:val="22"/>
         </w:rPr>
-        <w:t xml:space="preserve"> the Session 1 clean, the Session 2 analysis,</w:t>
+        <w:t xml:space="preserve"> from the three sessions — the clean, the</w:t>
       </w:r>
     </w:p>
     <w:p>
@@ -1322,7 +834,7 @@
           <w:color w:val="101110"/>
           <w:sz w:val="22"/>
         </w:rPr>
-        <w:t>and the Session 3 folder‑combine are all reusable starting points.</w:t>
+        <w:t>analysis, and the folder‑combine are all starting points.</w:t>
       </w:r>
     </w:p>
     <w:p>
@@ -1338,7 +850,7 @@
           <w:color w:val="101110"/>
           <w:sz w:val="22"/>
         </w:rPr>
-        <w:t>Steal the prompts.</w:t>
+        <w:t>Steal the prompts</w:t>
       </w:r>
       <w:r>
         <w:rPr>
@@ -1346,20 +858,7 @@
           <w:color w:val="101110"/>
           <w:sz w:val="22"/>
         </w:rPr>
-        <w:t xml:space="preserve"> The documentation and cleaning prompts in the Prompt</w:t>
-      </w:r>
-    </w:p>
-    <w:p>
-      <w:pPr>
-        <w:spacing w:after="120"/>
-      </w:pPr>
-      <w:r>
-        <w:rPr>
-          <w:rFonts w:ascii="Calibri" w:hAnsi="Calibri"/>
-          <w:color w:val="101110"/>
-          <w:sz w:val="22"/>
-        </w:rPr>
-        <w:t>Cheat Sheet were written for exactly this.</w:t>
+        <w:t xml:space="preserve"> in the Prompt Cheat Sheet — they were written for this.</w:t>
       </w:r>
     </w:p>
     <w:sectPr>

</xml_diff>